<commit_message>
Use the real repository URL in README and report
Co-Authored-By: Claude Sonnet 5.5 <noreply@anthropic.com>
</commit_message>
<xml_diff>
--- a/report/Tiny_Programming_Language_Compiler_Report.docx
+++ b/report/Tiny_Programming_Language_Compiler_Report.docx
@@ -6909,7 +6909,7 @@
               <w:rPr>
                 <w:sz w:val="17"/>
               </w:rPr>
-              <w:t xml:space="preserve"> finished in 5.663s</w:t>
+              <w:t xml:space="preserve"> finished in 5.893s</w:t>
             </w:r>
           </w:p>
         </w:tc>
@@ -8098,7 +8098,7 @@
           <w:rFonts w:ascii="Consolas" w:hAnsi="Consolas" w:eastAsia="Consolas"/>
           <w:sz w:val="17"/>
         </w:rPr>
-        <w:t>Ran 198 tests in 5.663s</w:t>
+        <w:t>Ran 198 tests in 5.893s</w:t>
       </w:r>
     </w:p>
     <w:p>
@@ -9646,7 +9646,7 @@
           <w:rFonts w:ascii="Consolas" w:hAnsi="Consolas" w:eastAsia="Consolas"/>
           <w:sz w:val="17"/>
         </w:rPr>
-        <w:t>git clone https://github.com/&lt;owner&gt;/Chirayu-Project.git</w:t>
+        <w:t>git clone https://github.com/Hydra-Of-Malice/Chirayu-Project.git</w:t>
       </w:r>
     </w:p>
     <w:p>

</xml_diff>